<commit_message>
Fix Manresa history retention and protect drafts
</commit_message>
<xml_diff>
--- a/Plantilla 1 equipo/listado jugadores y CT La Nucia FS.docx
+++ b/Plantilla 1 equipo/listado jugadores y CT La Nucia FS.docx
@@ -2028,8 +2028,6 @@
               </w:rPr>
               <w:t xml:space="preserve">     </w:t>
             </w:r>
-            <w:bookmarkStart w:id="0" w:name="_GoBack"/>
-            <w:bookmarkEnd w:id="0"/>
             <w:r>
               <w:rPr>
                 <w:color w:val="000000"/>
@@ -2108,6 +2106,15 @@
                 <w:szCs w:val="26"/>
               </w:rPr>
             </w:pPr>
+            <w:r>
+              <w:rPr>
+                <w:rFonts w:ascii="Times New Roman" w:eastAsia="Times New Roman" w:hAnsi="Times New Roman" w:cs="Times New Roman"/>
+                <w:color w:val="000000"/>
+                <w:sz w:val="26"/>
+                <w:szCs w:val="26"/>
+              </w:rPr>
+              <w:t>14</w:t>
+            </w:r>
           </w:p>
         </w:tc>
         <w:tc>
@@ -2174,6 +2181,16 @@
               <w:t>Alcayde</w:t>
             </w:r>
             <w:proofErr w:type="spellEnd"/>
+            <w:r>
+              <w:rPr>
+                <w:color w:val="000000"/>
+                <w:sz w:val="28"/>
+                <w:szCs w:val="28"/>
+              </w:rPr>
+              <w:t xml:space="preserve"> Moreno</w:t>
+            </w:r>
+            <w:bookmarkStart w:id="0" w:name="_GoBack"/>
+            <w:bookmarkEnd w:id="0"/>
           </w:p>
         </w:tc>
         <w:tc>
@@ -2251,24 +2268,6 @@
                 <w:szCs w:val="28"/>
               </w:rPr>
             </w:pPr>
-            <w:proofErr w:type="spellStart"/>
-            <w:r>
-              <w:rPr>
-                <w:color w:val="000000"/>
-                <w:sz w:val="28"/>
-                <w:szCs w:val="28"/>
-              </w:rPr>
-              <w:t>Jose</w:t>
-            </w:r>
-            <w:proofErr w:type="spellEnd"/>
-            <w:r>
-              <w:rPr>
-                <w:color w:val="000000"/>
-                <w:sz w:val="28"/>
-                <w:szCs w:val="28"/>
-              </w:rPr>
-              <w:t xml:space="preserve"> Luis</w:t>
-            </w:r>
           </w:p>
         </w:tc>
         <w:tc>
@@ -2293,24 +2292,6 @@
                 <w:szCs w:val="28"/>
               </w:rPr>
             </w:pPr>
-            <w:r>
-              <w:rPr>
-                <w:color w:val="000000"/>
-                <w:sz w:val="28"/>
-                <w:szCs w:val="28"/>
-              </w:rPr>
-              <w:t xml:space="preserve">Ruiz Ben </w:t>
-            </w:r>
-            <w:proofErr w:type="spellStart"/>
-            <w:r>
-              <w:rPr>
-                <w:color w:val="000000"/>
-                <w:sz w:val="28"/>
-                <w:szCs w:val="28"/>
-              </w:rPr>
-              <w:t>Hamu</w:t>
-            </w:r>
-            <w:proofErr w:type="spellEnd"/>
           </w:p>
         </w:tc>
         <w:tc>
@@ -2335,14 +2316,6 @@
                 <w:szCs w:val="24"/>
               </w:rPr>
             </w:pPr>
-            <w:r>
-              <w:rPr>
-                <w:color w:val="000000"/>
-                <w:sz w:val="24"/>
-                <w:szCs w:val="24"/>
-              </w:rPr>
-              <w:t>49374722R</w:t>
-            </w:r>
           </w:p>
         </w:tc>
       </w:tr>
@@ -2393,17 +2366,6 @@
                 <w:szCs w:val="28"/>
               </w:rPr>
             </w:pPr>
-            <w:proofErr w:type="spellStart"/>
-            <w:r>
-              <w:rPr>
-                <w:rFonts w:asciiTheme="minorHAnsi" w:eastAsia="Times New Roman" w:hAnsiTheme="minorHAnsi" w:cstheme="minorHAnsi"/>
-                <w:color w:val="000000"/>
-                <w:sz w:val="28"/>
-                <w:szCs w:val="28"/>
-              </w:rPr>
-              <w:t>Angel</w:t>
-            </w:r>
-            <w:proofErr w:type="spellEnd"/>
           </w:p>
         </w:tc>
         <w:tc>
@@ -2427,15 +2389,6 @@
                 <w:szCs w:val="28"/>
               </w:rPr>
             </w:pPr>
-            <w:r>
-              <w:rPr>
-                <w:rFonts w:asciiTheme="minorHAnsi" w:eastAsia="Times New Roman" w:hAnsiTheme="minorHAnsi" w:cstheme="minorHAnsi"/>
-                <w:color w:val="000000"/>
-                <w:sz w:val="28"/>
-                <w:szCs w:val="28"/>
-              </w:rPr>
-              <w:t>Vargas</w:t>
-            </w:r>
           </w:p>
         </w:tc>
         <w:tc>
@@ -2508,15 +2461,6 @@
                 <w:szCs w:val="26"/>
               </w:rPr>
             </w:pPr>
-            <w:r>
-              <w:rPr>
-                <w:rFonts w:ascii="Times New Roman" w:eastAsia="Times New Roman" w:hAnsi="Times New Roman" w:cs="Times New Roman"/>
-                <w:color w:val="000000"/>
-                <w:sz w:val="26"/>
-                <w:szCs w:val="26"/>
-              </w:rPr>
-              <w:t>Franz Esteban</w:t>
-            </w:r>
           </w:p>
         </w:tc>
         <w:tc>
@@ -2540,26 +2484,6 @@
                 <w:szCs w:val="26"/>
               </w:rPr>
             </w:pPr>
-            <w:proofErr w:type="spellStart"/>
-            <w:r>
-              <w:rPr>
-                <w:rFonts w:ascii="Times New Roman" w:eastAsia="Times New Roman" w:hAnsi="Times New Roman" w:cs="Times New Roman"/>
-                <w:color w:val="000000"/>
-                <w:sz w:val="26"/>
-                <w:szCs w:val="26"/>
-              </w:rPr>
-              <w:t>Monzo</w:t>
-            </w:r>
-            <w:proofErr w:type="spellEnd"/>
-            <w:r>
-              <w:rPr>
-                <w:rFonts w:ascii="Times New Roman" w:eastAsia="Times New Roman" w:hAnsi="Times New Roman" w:cs="Times New Roman"/>
-                <w:color w:val="000000"/>
-                <w:sz w:val="26"/>
-                <w:szCs w:val="26"/>
-              </w:rPr>
-              <w:t xml:space="preserve"> Cáceres</w:t>
-            </w:r>
           </w:p>
         </w:tc>
         <w:tc>
@@ -2583,15 +2507,6 @@
                 <w:szCs w:val="26"/>
               </w:rPr>
             </w:pPr>
-            <w:r>
-              <w:rPr>
-                <w:rFonts w:ascii="Times New Roman" w:eastAsia="Times New Roman" w:hAnsi="Times New Roman" w:cs="Times New Roman"/>
-                <w:color w:val="000000"/>
-                <w:sz w:val="26"/>
-                <w:szCs w:val="26"/>
-              </w:rPr>
-              <w:t>Y9274347W</w:t>
-            </w:r>
           </w:p>
         </w:tc>
       </w:tr>
@@ -2862,6 +2777,7 @@
                 <w:szCs w:val="26"/>
               </w:rPr>
             </w:pPr>
+            <w:proofErr w:type="spellStart"/>
             <w:r>
               <w:rPr>
                 <w:rFonts w:ascii="Times New Roman" w:eastAsia="Times New Roman" w:hAnsi="Times New Roman" w:cs="Times New Roman"/>
@@ -2869,7 +2785,17 @@
                 <w:sz w:val="26"/>
                 <w:szCs w:val="26"/>
               </w:rPr>
-              <w:t>Delegado</w:t>
+              <w:t>Ent</w:t>
+            </w:r>
+            <w:proofErr w:type="spellEnd"/>
+            <w:r>
+              <w:rPr>
+                <w:rFonts w:ascii="Times New Roman" w:eastAsia="Times New Roman" w:hAnsi="Times New Roman" w:cs="Times New Roman"/>
+                <w:color w:val="000000"/>
+                <w:sz w:val="26"/>
+                <w:szCs w:val="26"/>
+              </w:rPr>
+              <w:t>. Porteros</w:t>
             </w:r>
           </w:p>
         </w:tc>
@@ -2991,7 +2917,7 @@
                 <w:rFonts w:ascii="Times New Roman" w:eastAsia="Times New Roman" w:hAnsi="Times New Roman" w:cs="Times New Roman"/>
                 <w:color w:val="000000"/>
               </w:rPr>
-              <w:t>Delegado campo</w:t>
+              <w:t xml:space="preserve">Delegado </w:t>
             </w:r>
           </w:p>
         </w:tc>

</xml_diff>